<commit_message>
docs(v2): generate 0.2.2 STEP 00 DOCX
</commit_message>
<xml_diff>
--- a/docs/v2_0_2_2_planning/docx/00_V2_0.2.2_POST_RELEASE_AUDIT_AND_SCOPE.docx
+++ b/docs/v2_0_2_2_planning/docx/00_V2_0.2.2_POST_RELEASE_AUDIT_AND_SCOPE.docx
@@ -200,7 +200,7 @@
     </w:tbl>
     <w:p>
       <w:r>
-        <w:t>Status: **PASS**</w:t>
+        <w:t>Status: PASS</w:t>
       </w:r>
     </w:p>
     <w:p>
@@ -213,7 +213,7 @@
         <w:pStyle w:val="ListBullet"/>
       </w:pPr>
       <w:r>
-        <w:t>current planning baseline: `e9ff8540f3cad74035a592f4d4670c136ea64652`</w:t>
+        <w:t>current planning baseline: e9ff8540f3cad74035a592f4d4670c136ea64652</w:t>
       </w:r>
     </w:p>
     <w:p>
@@ -221,7 +221,7 @@
         <w:pStyle w:val="ListBullet"/>
       </w:pPr>
       <w:r>
-        <w:t>frozen stable release: `v0.2.1` @ `eb94efebf142ba8203dfc3ae3c5fa861222a0926`</w:t>
+        <w:t>frozen stable release: v0.2.1 @ eb94efebf142ba8203dfc3ae3c5fa861222a0926</w:t>
       </w:r>
     </w:p>
     <w:p>
@@ -229,7 +229,7 @@
         <w:pStyle w:val="ListBullet"/>
       </w:pPr>
       <w:r>
-        <w:t>previous stable: `v0.2.0` @ `c6ad75308d302cd816301a2a7a34ebe7eb4148a7`</w:t>
+        <w:t>previous stable: v0.2.0 @ c6ad75308d302cd816301a2a7a34ebe7eb4148a7</w:t>
       </w:r>
     </w:p>
     <w:p>
@@ -245,7 +245,7 @@
         <w:pStyle w:val="ListBullet"/>
       </w:pPr>
       <w:r>
-        <w:t>Published `v0.2.1` is immutable and must never be moved, overwritten, or republished.</w:t>
+        <w:t>Published v0.2.1 is immutable and must never be moved, overwritten, or republished.</w:t>
       </w:r>
     </w:p>
     <w:p>
@@ -253,7 +253,7 @@
         <w:pStyle w:val="ListBullet"/>
       </w:pPr>
       <w:r>
-        <w:t>Published `v0.2.0`, `v0.1.1`, and `v0.1.0` remain immutable history.</w:t>
+        <w:t>Published v0.2.0, v0.1.1, and v0.1.0 remain immutable history.</w:t>
       </w:r>
     </w:p>
     <w:p>
@@ -261,7 +261,7 @@
         <w:pStyle w:val="ListBullet"/>
       </w:pPr>
       <w:r>
-        <w:t>All v0.2.2 work must branch from current post-release `main`.</w:t>
+        <w:t>All v0.2.2 work must branch from current post-release main.</w:t>
       </w:r>
     </w:p>
     <w:p>
@@ -269,7 +269,7 @@
         <w:pStyle w:val="ListBullet"/>
       </w:pPr>
       <w:r>
-        <w:t>Schema v4 + `animation_keyframe_contract=advanced-v1` remains the production contract.</w:t>
+        <w:t>Schema v4 + animation_keyframe_contract=advanced-v1 remains the production contract.</w:t>
       </w:r>
     </w:p>
     <w:p>
@@ -311,7 +311,7 @@
         <w:pStyle w:val="ListBullet"/>
       </w:pPr>
       <w:r>
-        <w:t>v0.2.1 final workflow `37643499394`: PASS;</w:t>
+        <w:t>v0.2.1 final workflow 37643499394: PASS;</w:t>
       </w:r>
     </w:p>
     <w:p>
@@ -327,7 +327,7 @@
         <w:pStyle w:val="ListBullet"/>
       </w:pPr>
       <w:r>
-        <w:t>main CI `37643499386`: PASS;</w:t>
+        <w:t>main CI 37643499386: PASS;</w:t>
       </w:r>
     </w:p>
     <w:p>
@@ -335,7 +335,7 @@
         <w:pStyle w:val="ListBullet"/>
       </w:pPr>
       <w:r>
-        <w:t>main CodeQL `37643499315`: PASS;</w:t>
+        <w:t>main CodeQL 37643499315: PASS;</w:t>
       </w:r>
     </w:p>
     <w:p>
@@ -343,7 +343,7 @@
         <w:pStyle w:val="ListBullet"/>
       </w:pPr>
       <w:r>
-        <w:t>post-release main CI `37646796063`: PASS;</w:t>
+        <w:t>post-release main CI 37646796063: PASS;</w:t>
       </w:r>
     </w:p>
     <w:p>
@@ -364,7 +364,7 @@
     </w:p>
     <w:p>
       <w:r>
-        <w:t>v0.2.2 therefore becomes a **maintenance/hardening patch**, not a feature release.</w:t>
+        <w:t>v0.2.2 therefore becomes a maintenance/hardening patch, not a feature release.</w:t>
       </w:r>
     </w:p>
     <w:p>
@@ -411,7 +411,7 @@
     </w:p>
     <w:p>
       <w:r>
-        <w:t>`dependabot/github_actions/github-actions-fef1ef3f32` is diverged: one commit ahead but roughly forty commits behind current main. It only updates `.github/workflows/backup-single-app.yml`. Do not merge it as-is. Any update must be regenerated/rebased against current main and gated normally.</w:t>
+        <w:t>dependabot/github_actions/github-actions-fef1ef3f32 is diverged: one commit ahead but roughly forty commits behind current main. It only updates .github/workflows/backup-single-app.yml. Do not merge it as-is. Any update must be regenerated/rebased against current main and gated normally.</w:t>
       </w:r>
     </w:p>
     <w:p>
@@ -424,7 +424,7 @@
     </w:p>
     <w:p>
       <w:r>
-        <w:t>The repository has the canonical STEP09 screenshot pipeline, but `tests/visual` contains no executable visual tests. This is a coverage-structure gap, not a proven runtime bug.</w:t>
+        <w:t>The repository has the canonical STEP09 screenshot pipeline, but tests/visual contains no executable visual tests. This is a coverage-structure gap, not a proven runtime bug.</w:t>
       </w:r>
     </w:p>
     <w:p>
@@ -450,7 +450,7 @@
     </w:p>
     <w:p>
       <w:r>
-        <w:t>Promotion, first-overwrite `.pre-schema-v4.bak`, Save/Save As, recovery, no-downgrade, and future-schema rejection deserve stress coverage.</w:t>
+        <w:t>Promotion, first-overwrite .pre-schema-v4.bak, Save/Save As, recovery, no-downgrade, and future-schema rejection deserve stress coverage.</w:t>
       </w:r>
     </w:p>
     <w:p>
@@ -813,7 +813,7 @@
         <w:pStyle w:val="ListBullet"/>
       </w:pPr>
       <w:r>
-        <w:t>Read `V2_0.2.1_FINAL_STATUS.md` and `docs/v2_0_2_1_planning/FINAL_RELEASE_CLOSURE.md` first.</w:t>
+        <w:t>Read V2_0.2.1_FINAL_STATUS.md and docs/v2_0_2_1_planning/FINAL_RELEASE_CLOSURE.md first.</w:t>
       </w:r>
     </w:p>
     <w:p>

</xml_diff>